<commit_message>
Fix theory homework markdown for GitHub preview and rename to README.md.
Replace LaTeX math with plain text and code blocks to avoid garbled rendering on GitHub.

Co-authored-by: Cursor <cursoragent@cursor.com>
</commit_message>
<xml_diff>
--- a/theory_homework/hw1_basics/202411081003-武子杰-理论课作业一-基础知识部分.docx
+++ b/theory_homework/hw1_basics/202411081003-武子杰-理论课作业一-基础知识部分.docx
@@ -124,22 +124,20 @@
     </w:p>
     <w:p>
       <w:r>
-        <w:t>\[</w:t>
+        <w:rPr>
+          <w:rFonts w:ascii="Consolas" w:hAnsi="Consolas"/>
+          <w:sz w:val="18"/>
+        </w:rPr>
+        <w:t>T = | 2  0  1 |</w:t>
+        <w:br/>
+        <w:t xml:space="preserve">    | 0  1  1 |</w:t>
+        <w:br/>
+        <w:t xml:space="preserve">    | 0  0  1 |</w:t>
       </w:r>
     </w:p>
     <w:p>
       <w:r>
-        <w:t>T = \begin{bmatrix} 2 &amp; 0 &amp; 1 \\ 0 &amp; 1 &amp; 1 \\ 0 &amp; 0 &amp; 1 \end{bmatrix}</w:t>
-      </w:r>
-    </w:p>
-    <w:p>
-      <w:r>
-        <w:t>\]</w:t>
-      </w:r>
-    </w:p>
-    <w:p>
-      <w:r>
-        <w:t>对点 (x,y,1)^T：x' = 2x + 1,\; y' = y + 1。</w:t>
+        <w:t>对点 (x, y, 1)：x' = 2x + 1，y' = y + 1。</w:t>
       </w:r>
     </w:p>
     <w:p>
@@ -186,27 +184,23 @@
     </w:p>
     <w:p>
       <w:r>
-        <w:t>8. 绕原点旋转 \alpha 角的 2×2 旋转矩阵为：</w:t>
+        <w:t>8. 绕原点旋转 α 角的 2×2 旋转矩阵为：</w:t>
       </w:r>
     </w:p>
     <w:p>
       <w:r>
-        <w:t>\[</w:t>
+        <w:rPr>
+          <w:rFonts w:ascii="Consolas" w:hAnsi="Consolas"/>
+          <w:sz w:val="18"/>
+        </w:rPr>
+        <w:t>R(α) = | cos α   -sin α |</w:t>
+        <w:br/>
+        <w:t xml:space="preserve">       | sin α    cos α |</w:t>
       </w:r>
     </w:p>
     <w:p>
       <w:r>
-        <w:t>R(\alpha) = \begin{bmatrix} \cos\alpha &amp; -\sin\alpha \\ \sin\alpha &amp; \cos\alpha \end{bmatrix}</w:t>
-      </w:r>
-    </w:p>
-    <w:p>
-      <w:r>
-        <w:t>\]</w:t>
-      </w:r>
-    </w:p>
-    <w:p>
-      <w:r>
-        <w:t>若矩阵四个元素依次为 A、B、C、D，则 A=\cos\alpha，B=-\sin\alpha，C=\sin\alpha，D=\cos\alpha。题目中 B 为 \sin\alpha，应为 -\sin\alpha。</w:t>
+        <w:t>若矩阵四个元素依次为 A、B、C、D，则 A = cos α，B = -sin α，C = sin α，D = cos α。题目中 B 为 sin α，应为 -sin α。</w:t>
       </w:r>
     </w:p>
     <w:p>
@@ -260,47 +254,22 @@
     </w:p>
     <w:p>
       <w:r>
-        <w:t>对 (x,y,z,1)^T，绕 z 轴旋转 \theta：</w:t>
+        <w:t>对 (x, y, z, 1)，绕 z 轴旋转 θ：</w:t>
       </w:r>
     </w:p>
     <w:p>
       <w:r>
-        <w:t>\[</w:t>
-      </w:r>
-    </w:p>
-    <w:p>
-      <w:r>
-        <w:t>R_z(\theta) = \begin{bmatrix}</w:t>
-      </w:r>
-    </w:p>
-    <w:p>
-      <w:r>
-        <w:t>\cos\theta &amp; -\sin\theta &amp; 0 &amp; 0 \\</w:t>
-      </w:r>
-    </w:p>
-    <w:p>
-      <w:r>
-        <w:t>\sin\theta &amp; \cos\theta  &amp; 0 &amp; 0 \\</w:t>
-      </w:r>
-    </w:p>
-    <w:p>
-      <w:r>
-        <w:t>0         &amp; 0          &amp; 1 &amp; 0 \\</w:t>
-      </w:r>
-    </w:p>
-    <w:p>
-      <w:r>
-        <w:t>0         &amp; 0          &amp; 0 &amp; 1</w:t>
-      </w:r>
-    </w:p>
-    <w:p>
-      <w:r>
-        <w:t>\end{bmatrix}</w:t>
-      </w:r>
-    </w:p>
-    <w:p>
-      <w:r>
-        <w:t>\]</w:t>
+        <w:rPr>
+          <w:rFonts w:ascii="Consolas" w:hAnsi="Consolas"/>
+          <w:sz w:val="18"/>
+        </w:rPr>
+        <w:t>Rz(θ) = | cos θ  -sin θ   0   0 |</w:t>
+        <w:br/>
+        <w:t xml:space="preserve">        | sin θ   cos θ   0   0 |</w:t>
+        <w:br/>
+        <w:t xml:space="preserve">        |   0       0     1   0 |</w:t>
+        <w:br/>
+        <w:t xml:space="preserve">        |   0       0     0   1 |</w:t>
       </w:r>
     </w:p>
     <w:p>
@@ -313,27 +282,27 @@
     </w:p>
     <w:p>
       <w:r>
-        <w:t>设正方形顶点 A 为旋转中心，先沿 x 轴平移 n，再绕 A 顺时针旋转 \theta（顺时针即角度 -\theta）。</w:t>
+        <w:t>设正方形顶点 A 为旋转中心，先沿 x 轴平移 n，再绕 A 顺时针旋转 θ（顺时针即角度 -θ）。</w:t>
       </w:r>
     </w:p>
     <w:p>
       <w:r>
-        <w:t>1. 平移至 A 为原点：T_1 = \text{Trans}(-x_A, -y_A)</w:t>
+        <w:t>1. 平移至 A 为原点：T1 = Trans(-xA, -yA)</w:t>
       </w:r>
     </w:p>
     <w:p>
       <w:r>
-        <w:t>2. 旋转：R(-\theta)</w:t>
+        <w:t>2. 旋转：R(-θ)</w:t>
       </w:r>
     </w:p>
     <w:p>
       <w:r>
-        <w:t>3. 平移回去：T_2 = \text{Trans}(x_A+n, y_A)</w:t>
+        <w:t>3. 平移回去：T2 = Trans(xA + n, yA)</w:t>
       </w:r>
     </w:p>
     <w:p>
       <w:r>
-        <w:t>复合矩阵（右乘列向量）：M = T_2 \cdot R(-\theta) \cdot T_1 \cdot \text{Trans}(n,0)</w:t>
+        <w:t>复合矩阵（右乘列向量）：M = T2 · R(-θ) · T1 · Trans(n, 0)</w:t>
       </w:r>
     </w:p>
     <w:p>
@@ -343,42 +312,20 @@
     </w:p>
     <w:p>
       <w:r>
-        <w:t>\[</w:t>
+        <w:rPr>
+          <w:rFonts w:ascii="Consolas" w:hAnsi="Consolas"/>
+          <w:sz w:val="18"/>
+        </w:rPr>
+        <w:t>M = |  cos θ    sin θ   xA(1-cos θ)+yA·sin θ+n |</w:t>
+        <w:br/>
+        <w:t xml:space="preserve">    | -sin θ    cos θ   yA(1-cos θ)-xA·sin θ   |</w:t>
+        <w:br/>
+        <w:t xml:space="preserve">    |   0         0              1              |</w:t>
       </w:r>
     </w:p>
     <w:p>
       <w:r>
-        <w:t>M = \begin{bmatrix}</w:t>
-      </w:r>
-    </w:p>
-    <w:p>
-      <w:r>
-        <w:t>\cos\theta &amp; \sin\theta &amp; x_A(1-\cos\theta)+y_A\sin\theta+n \\</w:t>
-      </w:r>
-    </w:p>
-    <w:p>
-      <w:r>
-        <w:t>-\sin\theta &amp; \cos\theta &amp; y_A(1-\cos\theta)-x_A\sin\theta \\</w:t>
-      </w:r>
-    </w:p>
-    <w:p>
-      <w:r>
-        <w:t>0 &amp; 0 &amp; 1</w:t>
-      </w:r>
-    </w:p>
-    <w:p>
-      <w:r>
-        <w:t>\end{bmatrix}</w:t>
-      </w:r>
-    </w:p>
-    <w:p>
-      <w:r>
-        <w:t>\]</w:t>
-      </w:r>
-    </w:p>
-    <w:p>
-      <w:r>
-        <w:t>（若 A 为平移后正方形左下角，将 x_A,y_A 代入即可。）</w:t>
+        <w:t>（若 A 为平移后正方形左下角，将 xA、yA 代入即可。）</w:t>
       </w:r>
     </w:p>
     <w:p>

</xml_diff>